<commit_message>
Paper alignment to code baseline (v2.14/v2.8, four-layer chain)
- Baseline refresh: merged 87632 lines, CI full-chain green 2026-08-30
  (build + zero-Admitted check + coqchk kernel recheck)
- P0-2 softmax tightness: 2(e^d-1) -> exp(2d)-1 (matches
  softmax_l1_bound_exp code form), in all 6 files
- P0-1 audit wording unified: 'zero excluded-middle' -> 'Classical_Prop.classic
  (excluded-middle macro) zero occurrences' with axiom footprint disclosure
- P1-1 probe->authoritative module notes (ca_tau tau_crop_mono, ca_rip_cr)
- P1-2/P1-3 paper B: tau raw-vs-clamp code alignment note + tau_crop_mono cite
- Layers updated: drafts -> spec A v2.14 / spec B v2.8 -> formal versions
  -> 4 docx regenerated (md2docx_zh.py)
</commit_message>
<xml_diff>
--- a/papers/论文A正式版-CertifiedSparseGating-CPP-20260823.docx
+++ b/papers/论文A正式版-CertifiedSparseGating-CPP-20260823.docx
@@ -43,7 +43,7 @@
           <w:color w:val="444444"/>
           <w:sz w:val="21"/>
         </w:rPr>
-        <w:t>正式版（2026-08-26，对齐母版 v2.9）。来源：论文 A 草稿清洗（删除会话/评审/版本内部注记），</w:t>
+        <w:t>正式版（2026-08-30 更新，对齐母版 v2.14）。来源：论文 A 草稿清洗（删除会话/评审/版本内部注记），</w:t>
       </w:r>
     </w:p>
     <w:p>
@@ -58,7 +58,7 @@
           <w:color w:val="444444"/>
           <w:sz w:val="21"/>
         </w:rPr>
-        <w:t>全部代码数字按 2026-08-26 基态核验。投稿方向：CPP/ITP（形式化方法）。</w:t>
+        <w:t>全部代码数字按 2026-08-30 基态核验。投稿方向：CPP/ITP（形式化方法）。</w:t>
       </w:r>
     </w:p>
     <w:p>
@@ -133,27 +133,222 @@
           <w:color w:val="444444"/>
           <w:sz w:val="21"/>
         </w:rPr>
-        <w:t xml:space="preserve"> + 归档 </w:t>
-      </w:r>
-      <w:r>
-        <w:rPr>
-          <w:rFonts w:ascii="Consolas" w:hAnsi="Consolas" w:eastAsia="等线"/>
-          <w:b w:val="0"/>
-          <w:i w:val="0"/>
-          <w:color w:val="444444"/>
-          <w:sz w:val="19"/>
-        </w:rPr>
-        <w:t>30模块/</w:t>
-      </w:r>
-      <w:r>
-        <w:rPr>
-          <w:rFonts w:ascii="Times New Roman" w:hAnsi="Times New Roman" w:eastAsia="宋体"/>
-          <w:b w:val="0"/>
+        <w:t>（</w:t>
+      </w:r>
+      <w:r>
+        <w:rPr>
+          <w:rFonts w:ascii="Times New Roman" w:hAnsi="Times New Roman" w:eastAsia="宋体"/>
+          <w:b/>
           <w:i/>
           <w:color w:val="444444"/>
           <w:sz w:val="21"/>
         </w:rPr>
+        <w:t>87632 行，MERGE_EXIT=0；CI 全链路绿 2026-08-30——GitHub Actions 五步全过：lib 链编译 + 合并版编译（Rocq 9.0 + mathcomp 2.6 真环境）+ PSA 核心三文件 + 零 Admitted 检查 + coqchk 内核独立复验</w:t>
+      </w:r>
+      <w:r>
+        <w:rPr>
+          <w:rFonts w:ascii="Times New Roman" w:hAnsi="Times New Roman" w:eastAsia="宋体"/>
+          <w:b w:val="0"/>
+          <w:i/>
+          <w:color w:val="444444"/>
+          <w:sz w:val="21"/>
+        </w:rPr>
+        <w:t xml:space="preserve">）+ 归档 </w:t>
+      </w:r>
+      <w:r>
+        <w:rPr>
+          <w:rFonts w:ascii="Consolas" w:hAnsi="Consolas" w:eastAsia="等线"/>
+          <w:b w:val="0"/>
+          <w:i w:val="0"/>
+          <w:color w:val="444444"/>
+          <w:sz w:val="19"/>
+        </w:rPr>
+        <w:t>30模块/</w:t>
+      </w:r>
+      <w:r>
+        <w:rPr>
+          <w:rFonts w:ascii="Times New Roman" w:hAnsi="Times New Roman" w:eastAsia="宋体"/>
+          <w:b w:val="0"/>
+          <w:i/>
+          <w:color w:val="444444"/>
+          <w:sz w:val="21"/>
+        </w:rPr>
         <w:t>。</w:t>
+      </w:r>
+    </w:p>
+    <w:p>
+      <w:pPr>
+        <w:ind w:left="432"/>
+      </w:pPr>
+      <w:r>
+        <w:rPr>
+          <w:rFonts w:ascii="Times New Roman" w:hAnsi="Times New Roman" w:eastAsia="宋体"/>
+          <w:b w:val="0"/>
+          <w:i/>
+          <w:color w:val="444444"/>
+          <w:sz w:val="21"/>
+        </w:rPr>
+        <w:t>v2.14 修订要点：softmax 紧度勘误（</w:t>
+      </w:r>
+      <w:r>
+        <w:rPr>
+          <w:rFonts w:ascii="Consolas" w:hAnsi="Consolas" w:eastAsia="等线"/>
+          <w:b w:val="0"/>
+          <w:i w:val="0"/>
+          <w:color w:val="444444"/>
+          <w:sz w:val="19"/>
+        </w:rPr>
+        <w:t>2(e^d−1)</w:t>
+      </w:r>
+      <w:r>
+        <w:rPr>
+          <w:rFonts w:ascii="Times New Roman" w:hAnsi="Times New Roman" w:eastAsia="宋体"/>
+          <w:b w:val="0"/>
+          <w:i/>
+          <w:color w:val="444444"/>
+          <w:sz w:val="21"/>
+        </w:rPr>
+        <w:t xml:space="preserve"> → </w:t>
+      </w:r>
+      <w:r>
+        <w:rPr>
+          <w:rFonts w:ascii="Consolas" w:hAnsi="Consolas" w:eastAsia="等线"/>
+          <w:b w:val="0"/>
+          <w:i w:val="0"/>
+          <w:color w:val="444444"/>
+          <w:sz w:val="19"/>
+        </w:rPr>
+        <w:t>exp(2·d)−1</w:t>
+      </w:r>
+      <w:r>
+        <w:rPr>
+          <w:rFonts w:ascii="Times New Roman" w:hAnsi="Times New Roman" w:eastAsia="宋体"/>
+          <w:b w:val="0"/>
+          <w:i/>
+          <w:color w:val="444444"/>
+          <w:sz w:val="21"/>
+        </w:rPr>
+        <w:t xml:space="preserve">，对齐代码 </w:t>
+      </w:r>
+      <w:r>
+        <w:rPr>
+          <w:rFonts w:ascii="Consolas" w:hAnsi="Consolas" w:eastAsia="等线"/>
+          <w:b w:val="0"/>
+          <w:i w:val="0"/>
+          <w:color w:val="444444"/>
+          <w:sz w:val="19"/>
+        </w:rPr>
+        <w:t>softmax_l1_bound_exp</w:t>
+      </w:r>
+      <w:r>
+        <w:rPr>
+          <w:rFonts w:ascii="Times New Roman" w:hAnsi="Times New Roman" w:eastAsia="宋体"/>
+          <w:b w:val="0"/>
+          <w:i/>
+          <w:color w:val="444444"/>
+          <w:sz w:val="21"/>
+        </w:rPr>
+        <w:t xml:space="preserve"> 实形态）；审计口径统一为诚实表述（</w:t>
+      </w:r>
+      <w:r>
+        <w:rPr>
+          <w:rFonts w:ascii="Consolas" w:hAnsi="Consolas" w:eastAsia="等线"/>
+          <w:b w:val="0"/>
+          <w:i w:val="0"/>
+          <w:color w:val="444444"/>
+          <w:sz w:val="19"/>
+        </w:rPr>
+        <w:t>Classical_Prop.classic</w:t>
+      </w:r>
+      <w:r>
+        <w:rPr>
+          <w:rFonts w:ascii="Times New Roman" w:hAnsi="Times New Roman" w:eastAsia="宋体"/>
+          <w:b w:val="0"/>
+          <w:i/>
+          <w:color w:val="444444"/>
+          <w:sz w:val="21"/>
+        </w:rPr>
+        <w:t xml:space="preserve"> 排中律宏零出现 + 公理脚印披露）；τ/压缩感知族探针引用补注权威独立模块（</w:t>
+      </w:r>
+      <w:r>
+        <w:rPr>
+          <w:rFonts w:ascii="Consolas" w:hAnsi="Consolas" w:eastAsia="等线"/>
+          <w:b w:val="0"/>
+          <w:i w:val="0"/>
+          <w:color w:val="444444"/>
+          <w:sz w:val="19"/>
+        </w:rPr>
+        <w:t>ca_tau.v</w:t>
+      </w:r>
+      <w:r>
+        <w:rPr>
+          <w:rFonts w:ascii="Times New Roman" w:hAnsi="Times New Roman" w:eastAsia="宋体"/>
+          <w:b w:val="0"/>
+          <w:i/>
+          <w:color w:val="444444"/>
+          <w:sz w:val="21"/>
+        </w:rPr>
+        <w:t xml:space="preserve"> </w:t>
+      </w:r>
+      <w:r>
+        <w:rPr>
+          <w:rFonts w:ascii="Consolas" w:hAnsi="Consolas" w:eastAsia="等线"/>
+          <w:b w:val="0"/>
+          <w:i w:val="0"/>
+          <w:color w:val="444444"/>
+          <w:sz w:val="19"/>
+        </w:rPr>
+        <w:t>tau_crop_mono</w:t>
+      </w:r>
+      <w:r>
+        <w:rPr>
+          <w:rFonts w:ascii="Times New Roman" w:hAnsi="Times New Roman" w:eastAsia="宋体"/>
+          <w:b w:val="0"/>
+          <w:i/>
+          <w:color w:val="444444"/>
+          <w:sz w:val="21"/>
+        </w:rPr>
+        <w:t>、</w:t>
+      </w:r>
+      <w:r>
+        <w:rPr>
+          <w:rFonts w:ascii="Consolas" w:hAnsi="Consolas" w:eastAsia="等线"/>
+          <w:b w:val="0"/>
+          <w:i w:val="0"/>
+          <w:color w:val="444444"/>
+          <w:sz w:val="19"/>
+        </w:rPr>
+        <w:t>ca_rip_cr.v</w:t>
+      </w:r>
+      <w:r>
+        <w:rPr>
+          <w:rFonts w:ascii="Times New Roman" w:hAnsi="Times New Roman" w:eastAsia="宋体"/>
+          <w:b w:val="0"/>
+          <w:i/>
+          <w:color w:val="444444"/>
+          <w:sz w:val="21"/>
+        </w:rPr>
+        <w:t xml:space="preserve"> </w:t>
+      </w:r>
+      <w:r>
+        <w:rPr>
+          <w:rFonts w:ascii="Consolas" w:hAnsi="Consolas" w:eastAsia="等线"/>
+          <w:b w:val="0"/>
+          <w:i w:val="0"/>
+          <w:color w:val="444444"/>
+          <w:sz w:val="19"/>
+        </w:rPr>
+        <w:t>row_rip_bound_M</w:t>
+      </w:r>
+      <w:r>
+        <w:rPr>
+          <w:rFonts w:ascii="Times New Roman" w:hAnsi="Times New Roman" w:eastAsia="宋体"/>
+          <w:b w:val="0"/>
+          <w:i/>
+          <w:color w:val="444444"/>
+          <w:sz w:val="21"/>
+        </w:rPr>
+        <w:t>）。</w:t>
       </w:r>
     </w:p>
     <w:p>
@@ -1543,7 +1738,7 @@
           <w:i w:val="0"/>
           <w:sz w:val="24"/>
         </w:rPr>
-        <w:t>‖softmax z − softmax z'‖₁ ≤ 2(e^d − 1)）。</w:t>
+        <w:t>‖softmax z − softmax z'‖₁ ≤ exp(2·d) − 1；2026-08-30 勘误对齐代码实形态）。</w:t>
       </w:r>
     </w:p>
     <w:p>
@@ -2607,7 +2802,7 @@
           <w:i w:val="0"/>
           <w:sz w:val="24"/>
         </w:rPr>
-        <w:t>87588 行 / 57 顶层 Module（55 模块分区 + `ca_independence` 内 `independent`/`independent′` 2 附加）</w:t>
+        <w:t>87632 行 / 57 顶层 Module（55 模块分区 + `ca_independence` 内 `independent`/`independent′` 2 附加）</w:t>
       </w:r>
       <w:r>
         <w:rPr>
@@ -2712,6 +2907,24 @@
           <w:i w:val="0"/>
           <w:sz w:val="24"/>
         </w:rPr>
+        <w:t xml:space="preserve"> + </w:t>
+      </w:r>
+      <w:r>
+        <w:rPr>
+          <w:rFonts w:ascii="Times New Roman" w:hAnsi="Times New Roman" w:eastAsia="宋体"/>
+          <w:b/>
+          <w:i w:val="0"/>
+          <w:sz w:val="24"/>
+        </w:rPr>
+        <w:t>CS 战役族 taugrid/taugrid_cr/cs/cs5（2026-08-29，合计 64 Qed，未并入合并版）</w:t>
+      </w:r>
+      <w:r>
+        <w:rPr>
+          <w:rFonts w:ascii="Times New Roman" w:hAnsi="Times New Roman" w:eastAsia="宋体"/>
+          <w:b w:val="0"/>
+          <w:i w:val="0"/>
+          <w:sz w:val="24"/>
+        </w:rPr>
         <w:t>），</w:t>
       </w:r>
       <w:r>
@@ -3101,7 +3314,19 @@
           <w:i w:val="0"/>
           <w:sz w:val="20"/>
         </w:rPr>
-        <w:t>softmax_l1_bound_exp : ‖z−z'‖∞ ≤ d → ‖softmax z − softmax z'‖₁ ≤ 2(e^d − 1)</w:t>
+        <w:t>softmax_l1_bound_exp : ‖z−z'‖∞ ≤ d → ‖softmax z − softmax z'‖₁ ≤ exp(2·d) − 1</w:t>
+      </w:r>
+      <w:r>
+        <w:br/>
+      </w:r>
+      <w:r>
+        <w:rPr>
+          <w:rFonts w:ascii="Consolas" w:hAnsi="Consolas" w:eastAsia="等线"/>
+          <w:b w:val="0"/>
+          <w:i w:val="0"/>
+          <w:sz w:val="20"/>
+        </w:rPr>
+        <w:t xml:space="preserve">  (* 2026-08-30 勘误对齐代码 PSA_framework.v:2216-2220 实形态 *)</w:t>
       </w:r>
       <w:r>
         <w:br/>
@@ -7363,7 +7588,43 @@
           <w:i w:val="0"/>
           <w:sz w:val="24"/>
         </w:rPr>
-        <w:t>（probe_taudicho，零公理）：碰撞质量 τ 的窗内/OOD/三分刻画。</w:t>
+        <w:t>（probe_taudicho，零公理）：碰撞质量 τ 的窗内/OOD/三分刻画。权威独立模块：</w:t>
+      </w:r>
+      <w:r>
+        <w:rPr>
+          <w:rFonts w:ascii="Consolas" w:hAnsi="Consolas" w:eastAsia="等线"/>
+          <w:b w:val="0"/>
+          <w:i w:val="0"/>
+          <w:sz w:val="22"/>
+        </w:rPr>
+        <w:t>ca_tau.v</w:t>
+      </w:r>
+      <w:r>
+        <w:rPr>
+          <w:rFonts w:ascii="Times New Roman" w:hAnsi="Times New Roman" w:eastAsia="宋体"/>
+          <w:b w:val="0"/>
+          <w:i w:val="0"/>
+          <w:sz w:val="24"/>
+        </w:rPr>
+        <w:t xml:space="preserve"> </w:t>
+      </w:r>
+      <w:r>
+        <w:rPr>
+          <w:rFonts w:ascii="Consolas" w:hAnsi="Consolas" w:eastAsia="等线"/>
+          <w:b w:val="0"/>
+          <w:i w:val="0"/>
+          <w:sz w:val="22"/>
+        </w:rPr>
+        <w:t>tau_crop_mono</w:t>
+      </w:r>
+      <w:r>
+        <w:rPr>
+          <w:rFonts w:ascii="Times New Roman" w:hAnsi="Times New Roman" w:eastAsia="宋体"/>
+          <w:b w:val="0"/>
+          <w:i w:val="0"/>
+          <w:sz w:val="24"/>
+        </w:rPr>
+        <w:t>（N1≤N2 ⟹ Στ 裁剪单调，纯 mathcomp 零公理；v2.14 对齐补注）。</w:t>
       </w:r>
     </w:p>
     <w:p>
@@ -10707,6 +10968,890 @@
     </w:p>
     <w:p>
       <w:pPr>
+        <w:pStyle w:val="ListBullet"/>
+      </w:pPr>
+      <w:r>
+        <w:rPr>
+          <w:rFonts w:ascii="Times New Roman" w:hAnsi="Times New Roman" w:eastAsia="宋体"/>
+          <w:b/>
+          <w:i w:val="0"/>
+          <w:sz w:val="24"/>
+        </w:rPr>
+        <w:t>τ 裁剪最优性（CS-11，经典 R 轨道，2026-08-28 新增）</w:t>
+      </w:r>
+      <w:r>
+        <w:rPr>
+          <w:rFonts w:ascii="Times New Roman" w:hAnsi="Times New Roman" w:eastAsia="宋体"/>
+          <w:b w:val="0"/>
+          <w:i w:val="0"/>
+          <w:sz w:val="24"/>
+        </w:rPr>
+        <w:t xml:space="preserve"> </w:t>
+      </w:r>
+      <w:r>
+        <w:rPr>
+          <w:rFonts w:ascii="Consolas" w:hAnsi="Consolas" w:eastAsia="等线"/>
+          <w:b w:val="0"/>
+          <w:i w:val="0"/>
+          <w:sz w:val="22"/>
+        </w:rPr>
+        <w:t>probe_taugrid.v</w:t>
+      </w:r>
+      <w:r>
+        <w:rPr>
+          <w:rFonts w:ascii="Times New Roman" w:hAnsi="Times New Roman" w:eastAsia="宋体"/>
+          <w:b w:val="0"/>
+          <w:i w:val="0"/>
+          <w:sz w:val="24"/>
+        </w:rPr>
+        <w:t>（17 Qed / 0 Admitted）：</w:t>
+      </w:r>
+      <w:r>
+        <w:rPr>
+          <w:rFonts w:ascii="Times New Roman" w:hAnsi="Times New Roman" w:eastAsia="宋体"/>
+          <w:b/>
+          <w:i w:val="0"/>
+          <w:sz w:val="24"/>
+        </w:rPr>
+        <w:t>覆盖债精确量化</w:t>
+      </w:r>
+      <w:r>
+        <w:rPr>
+          <w:rFonts w:ascii="Times New Roman" w:hAnsi="Times New Roman" w:eastAsia="宋体"/>
+          <w:b w:val="0"/>
+          <w:i w:val="0"/>
+          <w:sz w:val="24"/>
+        </w:rPr>
+        <w:t xml:space="preserve"> </w:t>
+      </w:r>
+      <w:r>
+        <w:rPr>
+          <w:rFonts w:ascii="Consolas" w:hAnsi="Consolas" w:eastAsia="等线"/>
+          <w:b w:val="0"/>
+          <w:i w:val="0"/>
+          <w:sz w:val="22"/>
+        </w:rPr>
+        <w:t>coverage_fraction</w:t>
+      </w:r>
+      <w:r>
+        <w:rPr>
+          <w:rFonts w:ascii="Times New Roman" w:hAnsi="Times New Roman" w:eastAsia="宋体"/>
+          <w:b w:val="0"/>
+          <w:i w:val="0"/>
+          <w:sz w:val="24"/>
+        </w:rPr>
+        <w:t>/</w:t>
+      </w:r>
+      <w:r>
+        <w:rPr>
+          <w:rFonts w:ascii="Consolas" w:hAnsi="Consolas" w:eastAsia="等线"/>
+          <w:b w:val="0"/>
+          <w:i w:val="0"/>
+          <w:sz w:val="22"/>
+        </w:rPr>
+        <w:t>coverage_debt</w:t>
+      </w:r>
+      <w:r>
+        <w:rPr>
+          <w:rFonts w:ascii="Times New Roman" w:hAnsi="Times New Roman" w:eastAsia="宋体"/>
+          <w:b w:val="0"/>
+          <w:i w:val="0"/>
+          <w:sz w:val="24"/>
+        </w:rPr>
+        <w:t>（S T &lt; n ⟹ 窗 [0,T] 内能量恰 = (T+1)/n，窗外能量 1−(T+1)/n ∈ (0,1)——</w:t>
+      </w:r>
+      <w:r>
+        <w:rPr>
+          <w:rFonts w:ascii="Times New Roman" w:hAnsi="Times New Roman" w:eastAsia="宋体"/>
+          <w:b/>
+          <w:i w:val="0"/>
+          <w:sz w:val="24"/>
+        </w:rPr>
+        <w:t>τ 负债的机器可计算量</w:t>
+      </w:r>
+      <w:r>
+        <w:rPr>
+          <w:rFonts w:ascii="Times New Roman" w:hAnsi="Times New Roman" w:eastAsia="宋体"/>
+          <w:b w:val="0"/>
+          <w:i w:val="0"/>
+          <w:sz w:val="24"/>
+        </w:rPr>
+        <w:t>，"剪 255/127/63 应恶化"的定理侧镜像）；</w:t>
+      </w:r>
+      <w:r>
+        <w:rPr>
+          <w:rFonts w:ascii="Times New Roman" w:hAnsi="Times New Roman" w:eastAsia="宋体"/>
+          <w:b/>
+          <w:i w:val="0"/>
+          <w:sz w:val="24"/>
+        </w:rPr>
+        <w:t>支撑完备刻画</w:t>
+      </w:r>
+      <w:r>
+        <w:rPr>
+          <w:rFonts w:ascii="Times New Roman" w:hAnsi="Times New Roman" w:eastAsia="宋体"/>
+          <w:b w:val="0"/>
+          <w:i w:val="0"/>
+          <w:sz w:val="24"/>
+        </w:rPr>
+        <w:t xml:space="preserve"> </w:t>
+      </w:r>
+      <w:r>
+        <w:rPr>
+          <w:rFonts w:ascii="Consolas" w:hAnsi="Consolas" w:eastAsia="等线"/>
+          <w:b w:val="0"/>
+          <w:i w:val="0"/>
+          <w:sz w:val="22"/>
+        </w:rPr>
+        <w:t>support_classification</w:t>
+      </w:r>
+      <w:r>
+        <w:rPr>
+          <w:rFonts w:ascii="Times New Roman" w:hAnsi="Times New Roman" w:eastAsia="宋体"/>
+          <w:b w:val="0"/>
+          <w:i w:val="0"/>
+          <w:sz w:val="24"/>
+        </w:rPr>
+        <w:t>（n ≤ T ⟺ ψ_n 完全支撑训练窗，iff）；</w:t>
+      </w:r>
+      <w:r>
+        <w:rPr>
+          <w:rFonts w:ascii="Times New Roman" w:hAnsi="Times New Roman" w:eastAsia="宋体"/>
+          <w:b/>
+          <w:i w:val="0"/>
+          <w:sz w:val="24"/>
+        </w:rPr>
+        <w:t>裁剪证书单调</w:t>
+      </w:r>
+      <w:r>
+        <w:rPr>
+          <w:rFonts w:ascii="Times New Roman" w:hAnsi="Times New Roman" w:eastAsia="宋体"/>
+          <w:b w:val="0"/>
+          <w:i w:val="0"/>
+          <w:sz w:val="24"/>
+        </w:rPr>
+        <w:t xml:space="preserve"> </w:t>
+      </w:r>
+      <w:r>
+        <w:rPr>
+          <w:rFonts w:ascii="Consolas" w:hAnsi="Consolas" w:eastAsia="等线"/>
+          <w:b w:val="0"/>
+          <w:i w:val="0"/>
+          <w:sz w:val="22"/>
+        </w:rPr>
+        <w:t>prune_row_le</w:t>
+      </w:r>
+      <w:r>
+        <w:rPr>
+          <w:rFonts w:ascii="Times New Roman" w:hAnsi="Times New Roman" w:eastAsia="宋体"/>
+          <w:b w:val="0"/>
+          <w:i w:val="0"/>
+          <w:sz w:val="24"/>
+        </w:rPr>
+        <w:t>（kept 子族行和 ≤ 全族——上界型证书不损）；</w:t>
+      </w:r>
+      <w:r>
+        <w:rPr>
+          <w:rFonts w:ascii="Times New Roman" w:hAnsi="Times New Roman" w:eastAsia="宋体"/>
+          <w:b/>
+          <w:i w:val="0"/>
+          <w:sz w:val="24"/>
+        </w:rPr>
+        <w:t>C-梯子稀疏化迁移</w:t>
+      </w:r>
+      <w:r>
+        <w:rPr>
+          <w:rFonts w:ascii="Times New Roman" w:hAnsi="Times New Roman" w:eastAsia="宋体"/>
+          <w:b w:val="0"/>
+          <w:i w:val="0"/>
+          <w:sz w:val="24"/>
+        </w:rPr>
+        <w:t xml:space="preserve"> </w:t>
+      </w:r>
+      <w:r>
+        <w:rPr>
+          <w:rFonts w:ascii="Consolas" w:hAnsi="Consolas" w:eastAsia="等线"/>
+          <w:b w:val="0"/>
+          <w:i w:val="0"/>
+          <w:sz w:val="22"/>
+        </w:rPr>
+        <w:t>thinning_preserves_ratio</w:t>
+      </w:r>
+      <w:r>
+        <w:rPr>
+          <w:rFonts w:ascii="Times New Roman" w:hAnsi="Times New Roman" w:eastAsia="宋体"/>
+          <w:b w:val="0"/>
+          <w:i w:val="0"/>
+          <w:sz w:val="24"/>
+        </w:rPr>
+        <w:t>；</w:t>
+      </w:r>
+      <w:r>
+        <w:rPr>
+          <w:rFonts w:ascii="Times New Roman" w:hAnsi="Times New Roman" w:eastAsia="宋体"/>
+          <w:b/>
+          <w:i w:val="0"/>
+          <w:sz w:val="24"/>
+        </w:rPr>
+        <w:t>三连合成</w:t>
+      </w:r>
+      <w:r>
+        <w:rPr>
+          <w:rFonts w:ascii="Times New Roman" w:hAnsi="Times New Roman" w:eastAsia="宋体"/>
+          <w:b w:val="0"/>
+          <w:i w:val="0"/>
+          <w:sz w:val="24"/>
+        </w:rPr>
+        <w:t xml:space="preserve"> </w:t>
+      </w:r>
+      <w:r>
+        <w:rPr>
+          <w:rFonts w:ascii="Consolas" w:hAnsi="Consolas" w:eastAsia="等线"/>
+          <w:b w:val="0"/>
+          <w:i w:val="0"/>
+          <w:sz w:val="22"/>
+        </w:rPr>
+        <w:t>tau_prune_optimality</w:t>
+      </w:r>
+      <w:r>
+        <w:rPr>
+          <w:rFonts w:ascii="Times New Roman" w:hAnsi="Times New Roman" w:eastAsia="宋体"/>
+          <w:b w:val="0"/>
+          <w:i w:val="0"/>
+          <w:sz w:val="24"/>
+        </w:rPr>
+        <w:t>——randmax256/384 裁剪实验的定理化。</w:t>
+      </w:r>
+    </w:p>
+    <w:p>
+      <w:pPr>
+        <w:pStyle w:val="ListBullet"/>
+      </w:pPr>
+      <w:r>
+        <w:rPr>
+          <w:rFonts w:ascii="Times New Roman" w:hAnsi="Times New Roman" w:eastAsia="宋体"/>
+          <w:b/>
+          <w:i w:val="0"/>
+          <w:sz w:val="24"/>
+        </w:rPr>
+        <w:t>构造性孪生（CS-12，纯构造性轨道，2026-08-29 新增）</w:t>
+      </w:r>
+      <w:r>
+        <w:rPr>
+          <w:rFonts w:ascii="Times New Roman" w:hAnsi="Times New Roman" w:eastAsia="宋体"/>
+          <w:b w:val="0"/>
+          <w:i w:val="0"/>
+          <w:sz w:val="24"/>
+        </w:rPr>
+        <w:t xml:space="preserve"> </w:t>
+      </w:r>
+      <w:r>
+        <w:rPr>
+          <w:rFonts w:ascii="Consolas" w:hAnsi="Consolas" w:eastAsia="等线"/>
+          <w:b w:val="0"/>
+          <w:i w:val="0"/>
+          <w:sz w:val="22"/>
+        </w:rPr>
+        <w:t>probe_taugrid_cr.v</w:t>
+      </w:r>
+      <w:r>
+        <w:rPr>
+          <w:rFonts w:ascii="Times New Roman" w:hAnsi="Times New Roman" w:eastAsia="宋体"/>
+          <w:b w:val="0"/>
+          <w:i w:val="0"/>
+          <w:sz w:val="24"/>
+        </w:rPr>
+        <w:t xml:space="preserve">（13 Qed / 0 Admitted，Print Assumptions </w:t>
+      </w:r>
+      <w:r>
+        <w:rPr>
+          <w:rFonts w:ascii="Times New Roman" w:hAnsi="Times New Roman" w:eastAsia="宋体"/>
+          <w:b/>
+          <w:i w:val="0"/>
+          <w:sz w:val="24"/>
+        </w:rPr>
+        <w:t>全 Closed 零公理</w:t>
+      </w:r>
+      <w:r>
+        <w:rPr>
+          <w:rFonts w:ascii="Times New Roman" w:hAnsi="Times New Roman" w:eastAsia="宋体"/>
+          <w:b w:val="0"/>
+          <w:i w:val="0"/>
+          <w:sz w:val="24"/>
+        </w:rPr>
+        <w:t xml:space="preserve">）：抽象接口 </w:t>
+      </w:r>
+      <w:r>
+        <w:rPr>
+          <w:rFonts w:ascii="Consolas" w:hAnsi="Consolas" w:eastAsia="等线"/>
+          <w:b w:val="0"/>
+          <w:i w:val="0"/>
+          <w:sz w:val="22"/>
+        </w:rPr>
+        <w:t>{R : ConstructiveReals}</w:t>
+      </w:r>
+      <w:r>
+        <w:rPr>
+          <w:rFonts w:ascii="Times New Roman" w:hAnsi="Times New Roman" w:eastAsia="宋体"/>
+          <w:b w:val="0"/>
+          <w:i w:val="0"/>
+          <w:sz w:val="24"/>
+        </w:rPr>
+        <w:t xml:space="preserve"> + 归一梯子 u（cos/复指数构造性未实现，接口与主线数学一致）；</w:t>
+      </w:r>
+      <w:r>
+        <w:rPr>
+          <w:rFonts w:ascii="Times New Roman" w:hAnsi="Times New Roman" w:eastAsia="宋体"/>
+          <w:b/>
+          <w:i w:val="0"/>
+          <w:sz w:val="24"/>
+        </w:rPr>
+        <w:t>严格序 CRlt 本身是 Set 值</w:t>
+      </w:r>
+      <w:r>
+        <w:rPr>
+          <w:rFonts w:ascii="Times New Roman" w:hAnsi="Times New Roman" w:eastAsia="宋体"/>
+          <w:b w:val="0"/>
+          <w:i w:val="0"/>
+          <w:sz w:val="24"/>
+        </w:rPr>
+        <w:t xml:space="preserve">（ConstructiveReals.v:88 库设计），覆盖债界定定理以信息性形式 </w:t>
+      </w:r>
+      <w:r>
+        <w:rPr>
+          <w:rFonts w:ascii="Times New Roman" w:hAnsi="Times New Roman" w:eastAsia="宋体"/>
+          <w:b/>
+          <w:i w:val="0"/>
+          <w:sz w:val="24"/>
+        </w:rPr>
+        <w:t>0 &lt; debt &lt; 1</w:t>
+      </w:r>
+      <w:r>
+        <w:rPr>
+          <w:rFonts w:ascii="Times New Roman" w:hAnsi="Times New Roman" w:eastAsia="宋体"/>
+          <w:b w:val="0"/>
+          <w:i w:val="0"/>
+          <w:sz w:val="24"/>
+        </w:rPr>
+        <w:t>（Set 值 prod，证明项可提取）陈述，主定理结论 prod 型（信息性分支不能进 Prop 的 /\），sigT 被类型系统强制；序判定下放 Q 层（Qlt 判定经 CR_of_Q_lt 提升为带数据 CRlt，CRlt_proper 信息性搬运）；</w:t>
+      </w:r>
+      <w:r>
+        <w:rPr>
+          <w:rFonts w:ascii="Times New Roman" w:hAnsi="Times New Roman" w:eastAsia="宋体"/>
+          <w:b/>
+          <w:i w:val="0"/>
+          <w:sz w:val="24"/>
+        </w:rPr>
+        <w:t>提取 `taugrid_cr.ml` 经 DkMLNative ocamlc 4.14.2 编译通过</w:t>
+      </w:r>
+      <w:r>
+        <w:rPr>
+          <w:rFonts w:ascii="Times New Roman" w:hAnsi="Times New Roman" w:eastAsia="宋体"/>
+          <w:b w:val="0"/>
+          <w:i w:val="0"/>
+          <w:sz w:val="24"/>
+        </w:rPr>
+        <w:t>（柯西实例 cRealConstructive 具象化）。</w:t>
+      </w:r>
+    </w:p>
+    <w:p>
+      <w:pPr>
+        <w:pStyle w:val="ListBullet"/>
+      </w:pPr>
+      <w:r>
+        <w:rPr>
+          <w:rFonts w:ascii="Times New Roman" w:hAnsi="Times New Roman" w:eastAsia="宋体"/>
+          <w:b/>
+          <w:i w:val="0"/>
+          <w:sz w:val="24"/>
+        </w:rPr>
+        <w:t>CS 生产线（CS-13，经典 R 轨道，2026-08-29 新增）</w:t>
+      </w:r>
+      <w:r>
+        <w:rPr>
+          <w:rFonts w:ascii="Times New Roman" w:hAnsi="Times New Roman" w:eastAsia="宋体"/>
+          <w:b w:val="0"/>
+          <w:i w:val="0"/>
+          <w:sz w:val="24"/>
+        </w:rPr>
+        <w:t xml:space="preserve"> </w:t>
+      </w:r>
+      <w:r>
+        <w:rPr>
+          <w:rFonts w:ascii="Consolas" w:hAnsi="Consolas" w:eastAsia="等线"/>
+          <w:b w:val="0"/>
+          <w:i w:val="0"/>
+          <w:sz w:val="22"/>
+        </w:rPr>
+        <w:t>probe_cs.v</w:t>
+      </w:r>
+      <w:r>
+        <w:rPr>
+          <w:rFonts w:ascii="Times New Roman" w:hAnsi="Times New Roman" w:eastAsia="宋体"/>
+          <w:b w:val="0"/>
+          <w:i w:val="0"/>
+          <w:sz w:val="24"/>
+        </w:rPr>
+        <w:t>（29 Qed / 0 Admitted，审计仅 Dedekind 三允许公理）：</w:t>
+      </w:r>
+      <w:r>
+        <w:rPr>
+          <w:rFonts w:ascii="Times New Roman" w:hAnsi="Times New Roman" w:eastAsia="宋体"/>
+          <w:b/>
+          <w:i w:val="0"/>
+          <w:sz w:val="24"/>
+        </w:rPr>
+        <w:t>一致 RIP</w:t>
+      </w:r>
+      <w:r>
+        <w:rPr>
+          <w:rFonts w:ascii="Times New Roman" w:hAnsi="Times New Roman" w:eastAsia="宋体"/>
+          <w:b w:val="0"/>
+          <w:i w:val="0"/>
+          <w:sz w:val="24"/>
+        </w:rPr>
+        <w:t xml:space="preserve"> </w:t>
+      </w:r>
+      <w:r>
+        <w:rPr>
+          <w:rFonts w:ascii="Consolas" w:hAnsi="Consolas" w:eastAsia="等线"/>
+          <w:b w:val="0"/>
+          <w:i w:val="0"/>
+          <w:sz w:val="22"/>
+        </w:rPr>
+        <w:t>cs2_rip_uniform</w:t>
+      </w:r>
+      <w:r>
+        <w:rPr>
+          <w:rFonts w:ascii="Times New Roman" w:hAnsi="Times New Roman" w:eastAsia="宋体"/>
+          <w:b w:val="0"/>
+          <w:i w:val="0"/>
+          <w:sz w:val="24"/>
+        </w:rPr>
+        <w:t xml:space="preserve">（(1−δ)‖c‖² ≤ ‖Φc‖² ≤ (1+δ)‖c‖²，δ = 4K(C) </w:t>
+      </w:r>
+      <w:r>
+        <w:rPr>
+          <w:rFonts w:ascii="Times New Roman" w:hAnsi="Times New Roman" w:eastAsia="宋体"/>
+          <w:b/>
+          <w:i w:val="0"/>
+          <w:sz w:val="24"/>
+        </w:rPr>
+        <w:t>∀s 一致</w:t>
+      </w:r>
+      <w:r>
+        <w:rPr>
+          <w:rFonts w:ascii="Times New Roman" w:hAnsi="Times New Roman" w:eastAsia="宋体"/>
+          <w:b w:val="0"/>
+          <w:i w:val="0"/>
+          <w:sz w:val="24"/>
+        </w:rPr>
+        <w:t>）；</w:t>
+      </w:r>
+      <w:r>
+        <w:rPr>
+          <w:rFonts w:ascii="Times New Roman" w:hAnsi="Times New Roman" w:eastAsia="宋体"/>
+          <w:b/>
+          <w:i w:val="0"/>
+          <w:sz w:val="24"/>
+        </w:rPr>
+        <w:t>★s-sparse 唯一性</w:t>
+      </w:r>
+      <w:r>
+        <w:rPr>
+          <w:rFonts w:ascii="Times New Roman" w:hAnsi="Times New Roman" w:eastAsia="宋体"/>
+          <w:b w:val="0"/>
+          <w:i w:val="0"/>
+          <w:sz w:val="24"/>
+        </w:rPr>
+        <w:t xml:space="preserve"> </w:t>
+      </w:r>
+      <w:r>
+        <w:rPr>
+          <w:rFonts w:ascii="Consolas" w:hAnsi="Consolas" w:eastAsia="等线"/>
+          <w:b w:val="0"/>
+          <w:i w:val="0"/>
+          <w:sz w:val="22"/>
+        </w:rPr>
+        <w:t>cs3_energy_zero</w:t>
+      </w:r>
+      <w:r>
+        <w:rPr>
+          <w:rFonts w:ascii="Times New Roman" w:hAnsi="Times New Roman" w:eastAsia="宋体"/>
+          <w:b w:val="0"/>
+          <w:i w:val="0"/>
+          <w:sz w:val="24"/>
+        </w:rPr>
+        <w:t>/</w:t>
+      </w:r>
+      <w:r>
+        <w:rPr>
+          <w:rFonts w:ascii="Consolas" w:hAnsi="Consolas" w:eastAsia="等线"/>
+          <w:b w:val="0"/>
+          <w:i w:val="0"/>
+          <w:sz w:val="22"/>
+        </w:rPr>
+        <w:t>cs3_unique</w:t>
+      </w:r>
+      <w:r>
+        <w:rPr>
+          <w:rFonts w:ascii="Times New Roman" w:hAnsi="Times New Roman" w:eastAsia="宋体"/>
+          <w:b w:val="0"/>
+          <w:i w:val="0"/>
+          <w:sz w:val="24"/>
+        </w:rPr>
+        <w:t>（C ≥ 10：测量 y = y' ⟹ 系数 c = c'——测量端信息不丢失）；</w:t>
+      </w:r>
+      <w:r>
+        <w:rPr>
+          <w:rFonts w:ascii="Times New Roman" w:hAnsi="Times New Roman" w:eastAsia="宋体"/>
+          <w:b/>
+          <w:i w:val="0"/>
+          <w:sz w:val="24"/>
+        </w:rPr>
+        <w:t>embedding</w:t>
+      </w:r>
+      <w:r>
+        <w:rPr>
+          <w:rFonts w:ascii="Times New Roman" w:hAnsi="Times New Roman" w:eastAsia="宋体"/>
+          <w:b w:val="0"/>
+          <w:i w:val="0"/>
+          <w:sz w:val="24"/>
+        </w:rPr>
+        <w:t xml:space="preserve"> </w:t>
+      </w:r>
+      <w:r>
+        <w:rPr>
+          <w:rFonts w:ascii="Consolas" w:hAnsi="Consolas" w:eastAsia="等线"/>
+          <w:b w:val="0"/>
+          <w:i w:val="0"/>
+          <w:sz w:val="22"/>
+        </w:rPr>
+        <w:t>cs6_embedding</w:t>
+      </w:r>
+      <w:r>
+        <w:rPr>
+          <w:rFonts w:ascii="Times New Roman" w:hAnsi="Times New Roman" w:eastAsia="宋体"/>
+          <w:b w:val="0"/>
+          <w:i w:val="0"/>
+          <w:sz w:val="24"/>
+        </w:rPr>
+        <w:t>（1−2K(C) &gt; 0）；</w:t>
+      </w:r>
+      <w:r>
+        <w:rPr>
+          <w:rFonts w:ascii="Times New Roman" w:hAnsi="Times New Roman" w:eastAsia="宋体"/>
+          <w:b/>
+          <w:i w:val="0"/>
+          <w:sz w:val="24"/>
+        </w:rPr>
+        <w:t>spark 下界</w:t>
+      </w:r>
+      <w:r>
+        <w:rPr>
+          <w:rFonts w:ascii="Times New Roman" w:hAnsi="Times New Roman" w:eastAsia="宋体"/>
+          <w:b w:val="0"/>
+          <w:i w:val="0"/>
+          <w:sz w:val="24"/>
+        </w:rPr>
+        <w:t xml:space="preserve"> </w:t>
+      </w:r>
+      <w:r>
+        <w:rPr>
+          <w:rFonts w:ascii="Consolas" w:hAnsi="Consolas" w:eastAsia="等线"/>
+          <w:b w:val="0"/>
+          <w:i w:val="0"/>
+          <w:sz w:val="22"/>
+        </w:rPr>
+        <w:t>cs1b_spark</w:t>
+      </w:r>
+      <w:r>
+        <w:rPr>
+          <w:rFonts w:ascii="Times New Roman" w:hAnsi="Times New Roman" w:eastAsia="宋体"/>
+          <w:b w:val="0"/>
+          <w:i w:val="0"/>
+          <w:sz w:val="24"/>
+        </w:rPr>
+        <w:t>（spark ≥ n+1，Elad–Bruckstein 判据）；</w:t>
+      </w:r>
+      <w:r>
+        <w:rPr>
+          <w:rFonts w:ascii="Times New Roman" w:hAnsi="Times New Roman" w:eastAsia="宋体"/>
+          <w:b/>
+          <w:i w:val="0"/>
+          <w:sz w:val="24"/>
+        </w:rPr>
+        <w:t>逐对相干</w:t>
+      </w:r>
+      <w:r>
+        <w:rPr>
+          <w:rFonts w:ascii="Times New Roman" w:hAnsi="Times New Roman" w:eastAsia="宋体"/>
+          <w:b w:val="0"/>
+          <w:i w:val="0"/>
+          <w:sz w:val="24"/>
+        </w:rPr>
+        <w:t xml:space="preserve"> </w:t>
+      </w:r>
+      <w:r>
+        <w:rPr>
+          <w:rFonts w:ascii="Consolas" w:hAnsi="Consolas" w:eastAsia="等线"/>
+          <w:b w:val="0"/>
+          <w:i w:val="0"/>
+          <w:sz w:val="22"/>
+        </w:rPr>
+        <w:t>cs1a_pair_bound</w:t>
+      </w:r>
+      <w:r>
+        <w:rPr>
+          <w:rFonts w:ascii="Times New Roman" w:hAnsi="Times New Roman" w:eastAsia="宋体"/>
+          <w:b w:val="0"/>
+          <w:i w:val="0"/>
+          <w:sz w:val="24"/>
+        </w:rPr>
+        <w:t>（≤ 2πq/(1−q)）；</w:t>
+      </w:r>
+      <w:r>
+        <w:rPr>
+          <w:rFonts w:ascii="Times New Roman" w:hAnsi="Times New Roman" w:eastAsia="宋体"/>
+          <w:b/>
+          <w:i w:val="0"/>
+          <w:sz w:val="24"/>
+        </w:rPr>
+        <w:t>★近重复对爆炸</w:t>
+      </w:r>
+      <w:r>
+        <w:rPr>
+          <w:rFonts w:ascii="Times New Roman" w:hAnsi="Times New Roman" w:eastAsia="宋体"/>
+          <w:b w:val="0"/>
+          <w:i w:val="0"/>
+          <w:sz w:val="24"/>
+        </w:rPr>
+        <w:t xml:space="preserve"> </w:t>
+      </w:r>
+      <w:r>
+        <w:rPr>
+          <w:rFonts w:ascii="Consolas" w:hAnsi="Consolas" w:eastAsia="等线"/>
+          <w:b w:val="0"/>
+          <w:i w:val="0"/>
+          <w:sz w:val="22"/>
+        </w:rPr>
+        <w:t>near_dup_coherence_12</w:t>
+      </w:r>
+      <w:r>
+        <w:rPr>
+          <w:rFonts w:ascii="Times New Roman" w:hAnsi="Times New Roman" w:eastAsia="宋体"/>
+          <w:b w:val="0"/>
+          <w:i w:val="0"/>
+          <w:sz w:val="24"/>
+        </w:rPr>
+        <w:t xml:space="preserve">（coh 1 2 = </w:t>
+      </w:r>
+      <w:r>
+        <w:rPr>
+          <w:rFonts w:ascii="Times New Roman" w:hAnsi="Times New Roman" w:eastAsia="宋体"/>
+          <w:b/>
+          <w:i w:val="0"/>
+          <w:sz w:val="24"/>
+        </w:rPr>
+        <w:t>1/√2 精确值</w:t>
+      </w:r>
+      <w:r>
+        <w:rPr>
+          <w:rFonts w:ascii="Times New Roman" w:hAnsi="Times New Roman" w:eastAsia="宋体"/>
+          <w:b w:val="0"/>
+          <w:i w:val="0"/>
+          <w:sz w:val="24"/>
+        </w:rPr>
+        <w:t xml:space="preserve">）+ </w:t>
+      </w:r>
+      <w:r>
+        <w:rPr>
+          <w:rFonts w:ascii="Consolas" w:hAnsi="Consolas" w:eastAsia="等线"/>
+          <w:b w:val="0"/>
+          <w:i w:val="0"/>
+          <w:sz w:val="22"/>
+        </w:rPr>
+        <w:t>cs4c_explosion</w:t>
+      </w:r>
+      <w:r>
+        <w:rPr>
+          <w:rFonts w:ascii="Times New Roman" w:hAnsi="Times New Roman" w:eastAsia="宋体"/>
+          <w:b w:val="0"/>
+          <w:i w:val="0"/>
+          <w:sz w:val="24"/>
+        </w:rPr>
+        <w:t>（</w:t>
+      </w:r>
+      <w:r>
+        <w:rPr>
+          <w:rFonts w:ascii="Times New Roman" w:hAnsi="Times New Roman" w:eastAsia="宋体"/>
+          <w:b/>
+          <w:i w:val="0"/>
+          <w:sz w:val="24"/>
+        </w:rPr>
+        <w:t>2μ = √2 &gt; 1</w:t>
+      </w:r>
+      <w:r>
+        <w:rPr>
+          <w:rFonts w:ascii="Times New Roman" w:hAnsi="Times New Roman" w:eastAsia="宋体"/>
+          <w:b w:val="0"/>
+          <w:i w:val="0"/>
+          <w:sz w:val="24"/>
+        </w:rPr>
+        <w:t>——s ≥ 3 时 Gershgorin 型 RIP 证书在含近重复对梯子上必然失效，"剪 503/255/127 应恶化"完整定理链）。</w:t>
+      </w:r>
+    </w:p>
+    <w:p>
+      <w:pPr>
+        <w:pStyle w:val="ListBullet"/>
+      </w:pPr>
+      <w:r>
+        <w:rPr>
+          <w:rFonts w:ascii="Times New Roman" w:hAnsi="Times New Roman" w:eastAsia="宋体"/>
+          <w:b/>
+          <w:i w:val="0"/>
+          <w:sz w:val="24"/>
+        </w:rPr>
+        <w:t>offset 无关性（CS-14，经典 R 轨道，2026-08-29 新增）</w:t>
+      </w:r>
+      <w:r>
+        <w:rPr>
+          <w:rFonts w:ascii="Times New Roman" w:hAnsi="Times New Roman" w:eastAsia="宋体"/>
+          <w:b w:val="0"/>
+          <w:i w:val="0"/>
+          <w:sz w:val="24"/>
+        </w:rPr>
+        <w:t xml:space="preserve"> </w:t>
+      </w:r>
+      <w:r>
+        <w:rPr>
+          <w:rFonts w:ascii="Consolas" w:hAnsi="Consolas" w:eastAsia="等线"/>
+          <w:b w:val="0"/>
+          <w:i w:val="0"/>
+          <w:sz w:val="22"/>
+        </w:rPr>
+        <w:t>probe_cs5.v</w:t>
+      </w:r>
+      <w:r>
+        <w:rPr>
+          <w:rFonts w:ascii="Times New Roman" w:hAnsi="Times New Roman" w:eastAsia="宋体"/>
+          <w:b w:val="0"/>
+          <w:i w:val="0"/>
+          <w:sz w:val="24"/>
+        </w:rPr>
+        <w:t>（5 Qed / 0 Admitted）：</w:t>
+      </w:r>
+      <w:r>
+        <w:rPr>
+          <w:rFonts w:ascii="Times New Roman" w:hAnsi="Times New Roman" w:eastAsia="宋体"/>
+          <w:b/>
+          <w:i w:val="0"/>
+          <w:sz w:val="24"/>
+        </w:rPr>
+        <w:t>同族平移 t→t+δ 下跨网格对相干界不变</w:t>
+      </w:r>
+      <w:r>
+        <w:rPr>
+          <w:rFonts w:ascii="Times New Roman" w:hAnsi="Times New Roman" w:eastAsia="宋体"/>
+          <w:b w:val="0"/>
+          <w:i w:val="0"/>
+          <w:sz w:val="24"/>
+        </w:rPr>
+        <w:t>（≤ N/(2·min(j mod N, N−j mod N))，</w:t>
+      </w:r>
+      <w:r>
+        <w:rPr>
+          <w:rFonts w:ascii="Times New Roman" w:hAnsi="Times New Roman" w:eastAsia="宋体"/>
+          <w:b/>
+          <w:i w:val="0"/>
+          <w:sz w:val="24"/>
+        </w:rPr>
+        <w:t>右端不含 δ</w:t>
+      </w:r>
+      <w:r>
+        <w:rPr>
+          <w:rFonts w:ascii="Times New Roman" w:hAnsi="Times New Roman" w:eastAsia="宋体"/>
+          <w:b w:val="0"/>
+          <w:i w:val="0"/>
+          <w:sz w:val="24"/>
+        </w:rPr>
+        <w:t>——偏移在差频中相消，pair_dirichlet 接管）；</w:t>
+      </w:r>
+      <w:r>
+        <w:rPr>
+          <w:rFonts w:ascii="Times New Roman" w:hAnsi="Times New Roman" w:eastAsia="宋体"/>
+          <w:b/>
+          <w:i w:val="0"/>
+          <w:sz w:val="24"/>
+        </w:rPr>
+        <w:t>黄金比护城河</w:t>
+      </w:r>
+      <w:r>
+        <w:rPr>
+          <w:rFonts w:ascii="Times New Roman" w:hAnsi="Times New Roman" w:eastAsia="宋体"/>
+          <w:b w:val="0"/>
+          <w:i w:val="0"/>
+          <w:sz w:val="24"/>
+        </w:rPr>
+        <w:t xml:space="preserve"> </w:t>
+      </w:r>
+      <w:r>
+        <w:rPr>
+          <w:rFonts w:ascii="Consolas" w:hAnsi="Consolas" w:eastAsia="等线"/>
+          <w:b w:val="0"/>
+          <w:i w:val="0"/>
+          <w:sz w:val="22"/>
+        </w:rPr>
+        <w:t>cs5_golden_moat</w:t>
+      </w:r>
+      <w:r>
+        <w:rPr>
+          <w:rFonts w:ascii="Times New Roman" w:hAnsi="Times New Roman" w:eastAsia="宋体"/>
+          <w:b w:val="0"/>
+          <w:i w:val="0"/>
+          <w:sz w:val="24"/>
+        </w:rPr>
+        <w:t>（1/(3d) ≤ |d·φ_gold − m|）；</w:t>
+      </w:r>
+      <w:r>
+        <w:rPr>
+          <w:rFonts w:ascii="Times New Roman" w:hAnsi="Times New Roman" w:eastAsia="宋体"/>
+          <w:b/>
+          <w:i w:val="0"/>
+          <w:sz w:val="24"/>
+        </w:rPr>
+        <w:t>offset 语义非空</w:t>
+      </w:r>
+      <w:r>
+        <w:rPr>
+          <w:rFonts w:ascii="Times New Roman" w:hAnsi="Times New Roman" w:eastAsia="宋体"/>
+          <w:b w:val="0"/>
+          <w:i w:val="0"/>
+          <w:sz w:val="24"/>
+        </w:rPr>
+        <w:t xml:space="preserve"> </w:t>
+      </w:r>
+      <w:r>
+        <w:rPr>
+          <w:rFonts w:ascii="Consolas" w:hAnsi="Consolas" w:eastAsia="等线"/>
+          <w:b w:val="0"/>
+          <w:i w:val="0"/>
+          <w:sz w:val="22"/>
+        </w:rPr>
+        <w:t>cs5_gold_not_grid</w:t>
+      </w:r>
+      <w:r>
+        <w:rPr>
+          <w:rFonts w:ascii="Times New Roman" w:hAnsi="Times New Roman" w:eastAsia="宋体"/>
+          <w:b w:val="0"/>
+          <w:i w:val="0"/>
+          <w:sz w:val="24"/>
+        </w:rPr>
+        <w:t>（φ_gold ∉ ℤ）——ogrid 实验的定理侧。</w:t>
+      </w:r>
+    </w:p>
+    <w:p>
+      <w:pPr>
         <w:pStyle w:val="Heading2"/>
       </w:pPr>
       <w:r>
@@ -11653,7 +12798,7 @@
           <w:i w:val="0"/>
           <w:sz w:val="24"/>
         </w:rPr>
-        <w:t xml:space="preserve">（87588 行，57 顶层 Module = 55 模块分区 + </w:t>
+        <w:t xml:space="preserve">（87632 行，57 顶层 Module = 55 模块分区 + </w:t>
       </w:r>
       <w:r>
         <w:rPr>
@@ -12892,7 +14037,7 @@
           <w:i w:val="0"/>
           <w:sz w:val="24"/>
         </w:rPr>
-        <w:t xml:space="preserve"> 零出现（post-M1.5 复核，完整 165/165 运行日志随稿）；合并版（87588 行，57 顶层 Module = 55 模块分区 + 2 附加，含 20 个 z 区探针 + 构造性轨道</w:t>
+        <w:t xml:space="preserve"> 零出现（post-M1.5 复核，完整 165/165 运行日志随稿）；合并版（87632 行，57 顶层 Module = 55 模块分区 + 2 附加，含 20 个 z 区探针 + 构造性轨道</w:t>
       </w:r>
     </w:p>
     <w:p>
@@ -14141,7 +15286,7 @@
                 <w:i w:val="0"/>
                 <w:sz w:val="21"/>
               </w:rPr>
-              <w:t>src/ca_merged_full_25.v（87588 行，57 顶层 Module，20 探针 + ca_zeta_euler / ca_rip_cr 并入）</w:t>
+              <w:t>src/ca_merged_full_25.v（87632 行，57 顶层 Module，20 探针 + ca_zeta_euler / ca_rip_cr 并入）</w:t>
             </w:r>
           </w:p>
         </w:tc>

</xml_diff>

<commit_message>
m2 sweep fixes: dual-file sync of probe_frame_check_graduated/probe_ab_bridge_pier/probe_c4_four_atom_cr (E138 notation registration, eq_refl tactic form, Cnorm qualification, zpos_of_succ_c4 rename) + papers v2.17/v2.14 alignment (m2 green 92506 lines / 68 partitions, local 2.5 EXIT=0)
</commit_message>
<xml_diff>
--- a/papers/论文A正式版-CertifiedSparseGating-CPP-20260823.docx
+++ b/papers/论文A正式版-CertifiedSparseGating-CPP-20260823.docx
@@ -93,7 +93,7 @@
           <w:color w:val="444444"/>
           <w:sz w:val="21"/>
         </w:rPr>
-        <w:t>（91606 行，67 模块分区，SHA-256 基 4901f18e，MERGE_EXIT=0，公理审计 54 Closed + 111 Dedekind 三公理、</w:t>
+        <w:t xml:space="preserve">（93953 行，67 模块分区，SHA-256 基 4901f18e；G-7 批次另见合并版 </w:t>
       </w:r>
       <w:r>
         <w:rPr>
@@ -103,7 +103,7 @@
           <w:color w:val="444444"/>
           <w:sz w:val="19"/>
         </w:rPr>
-        <w:t>Classical_Prop.classic</w:t>
+        <w:t>ca_merged_full_25_m2.v</w:t>
       </w:r>
       <w:r>
         <w:rPr>
@@ -113,6 +113,26 @@
           <w:color w:val="444444"/>
           <w:sz w:val="21"/>
         </w:rPr>
+        <w:t>（92506 行，68 模块分区，本地 2.5 全量编译 EXIT=0，2026-08-31），公理审计 54 Closed + 111 Dedekind 三公理、</w:t>
+      </w:r>
+      <w:r>
+        <w:rPr>
+          <w:rFonts w:ascii="Consolas" w:hAnsi="Consolas" w:eastAsia="等线"/>
+          <w:b w:val="0"/>
+          <w:i w:val="0"/>
+          <w:color w:val="444444"/>
+          <w:sz w:val="19"/>
+        </w:rPr>
+        <w:t>Classical_Prop.classic</w:t>
+      </w:r>
+      <w:r>
+        <w:rPr>
+          <w:rFonts w:ascii="Times New Roman" w:hAnsi="Times New Roman" w:eastAsia="宋体"/>
+          <w:b w:val="0"/>
+          <w:i/>
+          <w:color w:val="444444"/>
+          <w:sz w:val="21"/>
+        </w:rPr>
         <w:t xml:space="preserve"> 零出现（2026-08-30 重跑确认）；持续集成全链路验证通过——lib 依赖链、合并版编译（Rocq 9.0 + mathcomp 2.6）、PSA 核心编译、零 Admitted 检查、coqchk 内核独立复验）。</w:t>
       </w:r>
     </w:p>
@@ -883,22 +903,70 @@
           <w:i w:val="0"/>
           <w:sz w:val="24"/>
         </w:rPr>
-        <w:t>representations), all machine-checked; on the C=4 ladder the instance μ = 11289/33920 &lt; 1/3</w:t>
-      </w:r>
-    </w:p>
-    <w:p>
-      <w:pPr>
-        <w:spacing w:line="336" w:lineRule="auto"/>
-        <w:ind w:firstLine="480"/>
-      </w:pPr>
-      <w:r>
-        <w:rPr>
-          <w:rFonts w:ascii="Times New Roman" w:hAnsi="Times New Roman" w:eastAsia="宋体"/>
-          <w:b w:val="0"/>
-          <w:i w:val="0"/>
-          <w:sz w:val="24"/>
-        </w:rPr>
-        <w:t>yields 3-atom sparse uniqueness for [3,13,53]. The audit comprises 165 Print</w:t>
+        <w:t>representations) whose Welch premise is itself proved constructively</w:t>
+      </w:r>
+    </w:p>
+    <w:p>
+      <w:pPr>
+        <w:spacing w:line="336" w:lineRule="auto"/>
+        <w:ind w:firstLine="480"/>
+      </w:pPr>
+      <w:r>
+        <w:rPr>
+          <w:rFonts w:ascii="Times New Roman" w:hAnsi="Times New Roman" w:eastAsia="宋体"/>
+          <w:b w:val="0"/>
+          <w:i w:val="0"/>
+          <w:sz w:val="24"/>
+        </w:rPr>
+        <w:t>(</w:t>
+      </w:r>
+      <w:r>
+        <w:rPr>
+          <w:rFonts w:ascii="Consolas" w:hAnsi="Consolas" w:eastAsia="等线"/>
+          <w:b w:val="0"/>
+          <w:i w:val="0"/>
+          <w:sz w:val="22"/>
+        </w:rPr>
+        <w:t>g7_welch_lower</w:t>
+      </w:r>
+      <w:r>
+        <w:rPr>
+          <w:rFonts w:ascii="Times New Roman" w:hAnsi="Times New Roman" w:eastAsia="宋体"/>
+          <w:b w:val="0"/>
+          <w:i w:val="0"/>
+          <w:sz w:val="24"/>
+        </w:rPr>
+        <w:t>: the squared Welch bound (M − N) ≤ N·(M−1)·μ² via Frobenius norm</w:t>
+      </w:r>
+    </w:p>
+    <w:p>
+      <w:pPr>
+        <w:spacing w:line="336" w:lineRule="auto"/>
+        <w:ind w:firstLine="480"/>
+      </w:pPr>
+      <w:r>
+        <w:rPr>
+          <w:rFonts w:ascii="Times New Roman" w:hAnsi="Times New Roman" w:eastAsia="宋体"/>
+          <w:b w:val="0"/>
+          <w:i w:val="0"/>
+          <w:sz w:val="24"/>
+        </w:rPr>
+        <w:t>and Cauchy–Schwarz, avoiding eigenvalue arguments), all machine-checked; on the C=4</w:t>
+      </w:r>
+    </w:p>
+    <w:p>
+      <w:pPr>
+        <w:spacing w:line="336" w:lineRule="auto"/>
+        <w:ind w:firstLine="480"/>
+      </w:pPr>
+      <w:r>
+        <w:rPr>
+          <w:rFonts w:ascii="Times New Roman" w:hAnsi="Times New Roman" w:eastAsia="宋体"/>
+          <w:b w:val="0"/>
+          <w:i w:val="0"/>
+          <w:sz w:val="24"/>
+        </w:rPr>
+        <w:t>ladder the instance μ = 11289/33920 &lt; 1/3 yields 3-atom sparse uniqueness for [3,13,53]. The audit comprises 165 Print</w:t>
       </w:r>
     </w:p>
     <w:p>
@@ -2831,7 +2899,7 @@
           <w:i w:val="0"/>
           <w:sz w:val="24"/>
         </w:rPr>
-        <w:t>91606 行 / 67 模块分区（55 模块分区 + `ca_independence` 内 `independent`/`independent′` 2 附加）</w:t>
+        <w:t>93953 行 / 67 模块分区（55 模块分区 + `ca_independence` 内 `independent`/`independent′` 2 附加）</w:t>
       </w:r>
       <w:r>
         <w:rPr>
@@ -4140,6 +4208,77 @@
           <w:sz w:val="20"/>
         </w:rPr>
         <w:t xml:space="preserve">  （相干字典不确定原理，构造性轨道 probe_uncertainty_cr.v：支撑大小版 1+1/μ，35 定理零经典）</w:t>
+      </w:r>
+      <w:r>
+        <w:br/>
+      </w:r>
+      <w:r>
+        <w:rPr>
+          <w:rFonts w:ascii="Consolas" w:hAnsi="Consolas" w:eastAsia="等线"/>
+          <w:b w:val="0"/>
+          <w:i w:val="0"/>
+          <w:sz w:val="20"/>
+        </w:rPr>
+      </w:r>
+      <w:r>
+        <w:br/>
+      </w:r>
+      <w:r>
+        <w:rPr>
+          <w:rFonts w:ascii="Consolas" w:hAnsi="Consolas" w:eastAsia="等线"/>
+          <w:b w:val="0"/>
+          <w:i w:val="0"/>
+          <w:sz w:val="20"/>
+        </w:rPr>
+        <w:t>g7_welch_lower (M N) (v) (mu) : 1 ≤ N → N &lt; M → (∀i&lt;M: Σ_{k&lt;N} v i k² = 1) →</w:t>
+      </w:r>
+      <w:r>
+        <w:br/>
+      </w:r>
+      <w:r>
+        <w:rPr>
+          <w:rFonts w:ascii="Consolas" w:hAnsi="Consolas" w:eastAsia="等线"/>
+          <w:b w:val="0"/>
+          <w:i w:val="0"/>
+          <w:sz w:val="20"/>
+        </w:rPr>
+        <w:t xml:space="preserve">  (∀i j&lt;M: i ≠ j → |Σ_k v i k·v j k| ≤ mu) →</w:t>
+      </w:r>
+      <w:r>
+        <w:br/>
+      </w:r>
+      <w:r>
+        <w:rPr>
+          <w:rFonts w:ascii="Consolas" w:hAnsi="Consolas" w:eastAsia="等线"/>
+          <w:b w:val="0"/>
+          <w:i w:val="0"/>
+          <w:sz w:val="20"/>
+        </w:rPr>
+        <w:t xml:space="preserve">  INR M − INR N ≤ INR N · INR (Nat.pred M) · mu · mu</w:t>
+      </w:r>
+      <w:r>
+        <w:br/>
+      </w:r>
+      <w:r>
+        <w:rPr>
+          <w:rFonts w:ascii="Consolas" w:hAnsi="Consolas" w:eastAsia="等线"/>
+          <w:b w:val="0"/>
+          <w:i w:val="0"/>
+          <w:sz w:val="20"/>
+        </w:rPr>
+        <w:t xml:space="preserve">  （Welch 下界平方形态，构造性轨道 probe_g7_welch_cr.v：Frobenius/Cauchy–Schwarz</w:t>
+      </w:r>
+      <w:r>
+        <w:br/>
+      </w:r>
+      <w:r>
+        <w:rPr>
+          <w:rFonts w:ascii="Consolas" w:hAnsi="Consolas" w:eastAsia="等线"/>
+          <w:b w:val="0"/>
+          <w:i w:val="0"/>
+          <w:sz w:val="20"/>
+        </w:rPr>
+        <w:t xml:space="preserve">  路线避特征值，14 Qed 六审计全 Closed，签名与 G-8 前提逐字一致）</w:t>
       </w:r>
     </w:p>
     <w:p>
@@ -11178,7 +11317,40 @@
           <w:i w:val="0"/>
           <w:sz w:val="24"/>
         </w:rPr>
-        <w:t xml:space="preserve">；前提状态：G-7 的完整构造性证明为后续工作，本合成定理在 Welch 前提悬空下陈述逻辑蕴含）与 </w:t>
+        <w:t>；前提状态（2026-08-31 升级）：该前提已由</w:t>
+      </w:r>
+    </w:p>
+    <w:p>
+      <w:pPr>
+        <w:spacing w:line="336" w:lineRule="auto"/>
+        <w:ind w:firstLine="480"/>
+      </w:pPr>
+      <w:r>
+        <w:rPr>
+          <w:rFonts w:ascii="Times New Roman" w:hAnsi="Times New Roman" w:eastAsia="宋体"/>
+          <w:b w:val="0"/>
+          <w:i w:val="0"/>
+          <w:sz w:val="24"/>
+        </w:rPr>
+        <w:t xml:space="preserve">G-7 构造性证明闭合（见下条 </w:t>
+      </w:r>
+      <w:r>
+        <w:rPr>
+          <w:rFonts w:ascii="Consolas" w:hAnsi="Consolas" w:eastAsia="等线"/>
+          <w:b w:val="0"/>
+          <w:i w:val="0"/>
+          <w:sz w:val="22"/>
+        </w:rPr>
+        <w:t>g7_welch_lower</w:t>
+      </w:r>
+      <w:r>
+        <w:rPr>
+          <w:rFonts w:ascii="Times New Roman" w:hAnsi="Times New Roman" w:eastAsia="宋体"/>
+          <w:b w:val="0"/>
+          <w:i w:val="0"/>
+          <w:sz w:val="24"/>
+        </w:rPr>
+        <w:t xml:space="preserve">，与 G-8 前提签名逐字一致））与 </w:t>
       </w:r>
       <w:r>
         <w:rPr>
@@ -11427,7 +11599,7 @@
           <w:i w:val="0"/>
           <w:sz w:val="24"/>
         </w:rPr>
-        <w:t>Welch 下界本身（G-7 构造性 Welch 完整证明）为后续工作（本条目以其平方形态为抽象前提）。</w:t>
+        <w:t>其 Welch 前提已由 G-7 构造性证明闭合（见下条）。</w:t>
       </w:r>
     </w:p>
     <w:p>
@@ -11441,6 +11613,305 @@
           <w:i w:val="0"/>
           <w:sz w:val="24"/>
         </w:rPr>
+        <w:t>Welch 下界构造性证明（G-7，纯构造性轨道，2026-08-31 新增）</w:t>
+      </w:r>
+      <w:r>
+        <w:rPr>
+          <w:rFonts w:ascii="Times New Roman" w:hAnsi="Times New Roman" w:eastAsia="宋体"/>
+          <w:b w:val="0"/>
+          <w:i w:val="0"/>
+          <w:sz w:val="24"/>
+        </w:rPr>
+        <w:t xml:space="preserve"> </w:t>
+      </w:r>
+      <w:r>
+        <w:rPr>
+          <w:rFonts w:ascii="Consolas" w:hAnsi="Consolas" w:eastAsia="等线"/>
+          <w:b w:val="0"/>
+          <w:i w:val="0"/>
+          <w:sz w:val="22"/>
+        </w:rPr>
+        <w:t>g7_welch_lower</w:t>
+      </w:r>
+    </w:p>
+    <w:p>
+      <w:pPr>
+        <w:spacing w:line="336" w:lineRule="auto"/>
+        <w:ind w:firstLine="480"/>
+      </w:pPr>
+      <w:r>
+        <w:rPr>
+          <w:rFonts w:ascii="Times New Roman" w:hAnsi="Times New Roman" w:eastAsia="宋体"/>
+          <w:b w:val="0"/>
+          <w:i w:val="0"/>
+          <w:sz w:val="24"/>
+        </w:rPr>
+        <w:t>（probe_g7_welch_cr.v）：</w:t>
+      </w:r>
+      <w:r>
+        <w:rPr>
+          <w:rFonts w:ascii="Times New Roman" w:hAnsi="Times New Roman" w:eastAsia="宋体"/>
+          <w:b/>
+          <w:i w:val="0"/>
+          <w:sz w:val="24"/>
+        </w:rPr>
+        <w:t>Welch 下界平方形态的完整构造性证明</w:t>
+      </w:r>
+      <w:r>
+        <w:rPr>
+          <w:rFonts w:ascii="Times New Roman" w:hAnsi="Times New Roman" w:eastAsia="宋体"/>
+          <w:b w:val="0"/>
+          <w:i w:val="0"/>
+          <w:sz w:val="24"/>
+        </w:rPr>
+        <w:t>——M 个单位范数原子</w:t>
+      </w:r>
+    </w:p>
+    <w:p>
+      <w:pPr>
+        <w:spacing w:line="336" w:lineRule="auto"/>
+        <w:ind w:firstLine="480"/>
+      </w:pPr>
+      <w:r>
+        <w:rPr>
+          <w:rFonts w:ascii="Times New Roman" w:hAnsi="Times New Roman" w:eastAsia="宋体"/>
+          <w:b w:val="0"/>
+          <w:i w:val="0"/>
+          <w:sz w:val="24"/>
+        </w:rPr>
+        <w:t>（实向量，维度 N，N &lt; M）两两相干 ≤ μ ⟹ `(INR M − INR N) ≤ INR N · INR (Nat.pred M)</w:t>
+      </w:r>
+    </w:p>
+    <w:p>
+      <w:pPr>
+        <w:spacing w:line="336" w:lineRule="auto"/>
+        <w:ind w:firstLine="480"/>
+      </w:pPr>
+      <w:r>
+        <w:rPr>
+          <w:rFonts w:ascii="Times New Roman" w:hAnsi="Times New Roman" w:eastAsia="宋体"/>
+          <w:b w:val="0"/>
+          <w:i w:val="0"/>
+          <w:sz w:val="24"/>
+        </w:rPr>
+        <w:t>· mu · mu`（与 G-8 前提签名逐字一致）。证明路线：Frobenius 范数与 Cauchy–Schwarz</w:t>
+      </w:r>
+    </w:p>
+    <w:p>
+      <w:pPr>
+        <w:spacing w:line="336" w:lineRule="auto"/>
+        <w:ind w:firstLine="480"/>
+      </w:pPr>
+      <w:r>
+        <w:rPr>
+          <w:rFonts w:ascii="Times New Roman" w:hAnsi="Times New Roman" w:eastAsia="宋体"/>
+          <w:b w:val="0"/>
+          <w:i w:val="0"/>
+          <w:sz w:val="24"/>
+        </w:rPr>
+        <w:t>不等式（避免特征值论证——构造性实数轨道无谱定理可用）：①迹恒等式（帧算子对角和 =</w:t>
+      </w:r>
+    </w:p>
+    <w:p>
+      <w:pPr>
+        <w:spacing w:line="336" w:lineRule="auto"/>
+        <w:ind w:firstLine="480"/>
+      </w:pPr>
+      <w:r>
+        <w:rPr>
+          <w:rFonts w:ascii="Times New Roman" w:hAnsi="Times New Roman" w:eastAsia="宋体"/>
+          <w:b w:val="0"/>
+          <w:i w:val="0"/>
+          <w:sz w:val="24"/>
+        </w:rPr>
+        <w:t xml:space="preserve">INR(M)，单位范数经求和换序）；② Cauchy–Schwarz（Lagrange 恒等式 </w:t>
+      </w:r>
+      <w:r>
+        <w:rPr>
+          <w:rFonts w:ascii="Consolas" w:hAnsi="Consolas" w:eastAsia="等线"/>
+          <w:b w:val="0"/>
+          <w:i w:val="0"/>
+          <w:sz w:val="22"/>
+        </w:rPr>
+        <w:t>cs_core</w:t>
+      </w:r>
+      <w:r>
+        <w:rPr>
+          <w:rFonts w:ascii="Times New Roman" w:hAnsi="Times New Roman" w:eastAsia="宋体"/>
+          <w:b w:val="0"/>
+          <w:i w:val="0"/>
+          <w:sz w:val="24"/>
+        </w:rPr>
+        <w:t>：双和</w:t>
+      </w:r>
+    </w:p>
+    <w:p>
+      <w:pPr>
+        <w:spacing w:line="336" w:lineRule="auto"/>
+        <w:ind w:firstLine="480"/>
+      </w:pPr>
+      <w:r>
+        <w:rPr>
+          <w:rFonts w:ascii="Times New Roman" w:hAnsi="Times New Roman" w:eastAsia="宋体"/>
+          <w:b w:val="0"/>
+          <w:i w:val="0"/>
+          <w:sz w:val="24"/>
+        </w:rPr>
+        <w:t>平方差非负，零开方、零特征值）；③ 部分和 ≤ 全和；④ Frobenius 恒等式（帧算子与</w:t>
+      </w:r>
+    </w:p>
+    <w:p>
+      <w:pPr>
+        <w:spacing w:line="336" w:lineRule="auto"/>
+        <w:ind w:firstLine="480"/>
+      </w:pPr>
+      <w:r>
+        <w:rPr>
+          <w:rFonts w:ascii="Times New Roman" w:hAnsi="Times New Roman" w:eastAsia="宋体"/>
+          <w:b w:val="0"/>
+          <w:i w:val="0"/>
+          <w:sz w:val="24"/>
+        </w:rPr>
+        <w:t>Gram 矩阵的 Frobenius 范数相等，四层求和换位）；⑤ 相干聚束（对角 = 1、非对角 ≤ μ²，</w:t>
+      </w:r>
+    </w:p>
+    <w:p>
+      <w:pPr>
+        <w:spacing w:line="336" w:lineRule="auto"/>
+        <w:ind w:firstLine="480"/>
+      </w:pPr>
+      <w:r>
+        <w:rPr>
+          <w:rFonts w:ascii="Times New Roman" w:hAnsi="Times New Roman" w:eastAsia="宋体"/>
+          <w:b w:val="0"/>
+          <w:i w:val="0"/>
+          <w:sz w:val="24"/>
+        </w:rPr>
+        <w:t>对最大原子索引归纳，增量 1 + 2·INR(S M)·μ² 精确闭合）→ CR 代数移项（乘正消去）。</w:t>
+      </w:r>
+    </w:p>
+    <w:p>
+      <w:pPr>
+        <w:spacing w:line="336" w:lineRule="auto"/>
+        <w:ind w:firstLine="480"/>
+      </w:pPr>
+      <w:r>
+        <w:rPr>
+          <w:rFonts w:ascii="Times New Roman" w:hAnsi="Times New Roman" w:eastAsia="宋体"/>
+          <w:b/>
+          <w:i w:val="0"/>
+          <w:sz w:val="24"/>
+        </w:rPr>
+        <w:t>验收</w:t>
+      </w:r>
+      <w:r>
+        <w:rPr>
+          <w:rFonts w:ascii="Times New Roman" w:hAnsi="Times New Roman" w:eastAsia="宋体"/>
+          <w:b w:val="0"/>
+          <w:i w:val="0"/>
+          <w:sz w:val="24"/>
+        </w:rPr>
+        <w:t>：828 行 14 Qed / 0 Admitted / 0 公理，六段 Print Assumptions 全 "Closed</w:t>
+      </w:r>
+    </w:p>
+    <w:p>
+      <w:pPr>
+        <w:spacing w:line="336" w:lineRule="auto"/>
+        <w:ind w:firstLine="480"/>
+      </w:pPr>
+      <w:r>
+        <w:rPr>
+          <w:rFonts w:ascii="Times New Roman" w:hAnsi="Times New Roman" w:eastAsia="宋体"/>
+          <w:b w:val="0"/>
+          <w:i w:val="0"/>
+          <w:sz w:val="24"/>
+        </w:rPr>
+        <w:t>under the global context"；提取物 g7_welch_cr.ml 经 DkMLNative ocamlc 编译通过；</w:t>
+      </w:r>
+    </w:p>
+    <w:p>
+      <w:pPr>
+        <w:spacing w:line="336" w:lineRule="auto"/>
+        <w:ind w:firstLine="480"/>
+      </w:pPr>
+      <w:r>
+        <w:rPr>
+          <w:rFonts w:ascii="Times New Roman" w:hAnsi="Times New Roman" w:eastAsia="宋体"/>
+          <w:b w:val="0"/>
+          <w:i w:val="0"/>
+          <w:sz w:val="24"/>
+        </w:rPr>
+        <w:t xml:space="preserve">已并入合并版 </w:t>
+      </w:r>
+      <w:r>
+        <w:rPr>
+          <w:rFonts w:ascii="Consolas" w:hAnsi="Consolas" w:eastAsia="等线"/>
+          <w:b w:val="0"/>
+          <w:i w:val="0"/>
+          <w:sz w:val="22"/>
+        </w:rPr>
+        <w:t>ca_merged_full_25_m2.v</w:t>
+      </w:r>
+      <w:r>
+        <w:rPr>
+          <w:rFonts w:ascii="Times New Roman" w:hAnsi="Times New Roman" w:eastAsia="宋体"/>
+          <w:b w:val="0"/>
+          <w:i w:val="0"/>
+          <w:sz w:val="24"/>
+        </w:rPr>
+        <w:t>（92506 行，68 模块分区，本地 2.5 全量编译 EXIT=0）。</w:t>
+      </w:r>
+    </w:p>
+    <w:p>
+      <w:pPr>
+        <w:spacing w:line="336" w:lineRule="auto"/>
+        <w:ind w:firstLine="480"/>
+      </w:pPr>
+      <w:r>
+        <w:rPr>
+          <w:rFonts w:ascii="Times New Roman" w:hAnsi="Times New Roman" w:eastAsia="宋体"/>
+          <w:b/>
+          <w:i w:val="0"/>
+          <w:sz w:val="24"/>
+        </w:rPr>
+        <w:t>范围（如实）</w:t>
+      </w:r>
+      <w:r>
+        <w:rPr>
+          <w:rFonts w:ascii="Times New Roman" w:hAnsi="Times New Roman" w:eastAsia="宋体"/>
+          <w:b w:val="0"/>
+          <w:i w:val="0"/>
+          <w:sz w:val="24"/>
+        </w:rPr>
+        <w:t>：实原子版（原子分量为构造性实数；G-8 的消费为抽象相干上界 μ，</w:t>
+      </w:r>
+    </w:p>
+    <w:p>
+      <w:pPr>
+        <w:spacing w:line="336" w:lineRule="auto"/>
+        <w:ind w:firstLine="480"/>
+      </w:pPr>
+      <w:r>
+        <w:rPr>
+          <w:rFonts w:ascii="Times New Roman" w:hAnsi="Times New Roman" w:eastAsia="宋体"/>
+          <w:b w:val="0"/>
+          <w:i w:val="0"/>
+          <w:sz w:val="24"/>
+        </w:rPr>
+        <w:t>实版直接衔接）；复原子版（复向量内积的 Welch 下界）列为后续工作。</w:t>
+      </w:r>
+    </w:p>
+    <w:p>
+      <w:pPr>
+        <w:pStyle w:val="ListBullet"/>
+      </w:pPr>
+      <w:r>
+        <w:rPr>
+          <w:rFonts w:ascii="Times New Roman" w:hAnsi="Times New Roman" w:eastAsia="宋体"/>
+          <w:b/>
+          <w:i w:val="0"/>
+          <w:sz w:val="24"/>
+        </w:rPr>
         <w:t>加权阶梯范数精确闭式（G-1，经典 R 轨道）</w:t>
       </w:r>
       <w:r>
@@ -12307,7 +12778,7 @@
           <w:i w:val="0"/>
           <w:sz w:val="24"/>
         </w:rPr>
-        <w:t xml:space="preserve">：sparse_uniquenessM、CRrip_bound_k、row_rip_bound_M、CRrecovery_correct_prefix、CRuncertainty_principle、CRg8_recovery_synthesis 与 C4_sparse_uniqueness_3 是 Gershgorin/互干性唯一恢复、RIP、Donoho–Stark 不确定性原理与 Welch 界-恢复保证相图的机器检查，数学上非新，形式化价值在 Coq 验证（含 C=4 具体常数核验、行和版 RIP 常数紧化路径、构造性轨道独立性验证与三角闭合相图合成）。本族主要探针已并入合并版 </w:t>
+        <w:t xml:space="preserve">：sparse_uniquenessM、CRrip_bound_k、row_rip_bound_M、CRrecovery_correct_prefix、CRuncertainty_principle、CRg8_recovery_synthesis 与 C4_sparse_uniqueness_3 是 Gershgorin/互干性唯一恢复、RIP、Donoho–Stark 不确定性原理与 Welch 界-恢复保证相图的机器检查（Welch 下界本身亦为经典结果的构造性机器检查），数学上非新，形式化价值在 Coq 验证（含 C=4 具体常数核验、行和版 RIP 常数紧化路径、构造性轨道独立性验证与三角闭合相图合成）。本族主要探针已并入合并版 </w:t>
       </w:r>
       <w:r>
         <w:rPr>
@@ -14415,7 +14886,7 @@
           <w:i w:val="0"/>
           <w:sz w:val="24"/>
         </w:rPr>
-        <w:t xml:space="preserve">（91606 行，67 模块分区 + </w:t>
+        <w:t xml:space="preserve">（93953 行，67 模块分区 + </w:t>
       </w:r>
       <w:r>
         <w:rPr>
@@ -17604,7 +18075,7 @@
           <w:i w:val="0"/>
           <w:sz w:val="24"/>
         </w:rPr>
-        <w:t xml:space="preserve"> 零出现（post-M1.5 复核，完整 165/165 运行日志随稿）；合并版（91606 行，67 模块分区 + 2 附加，含 20 个 z 区探针 + 构造性轨道</w:t>
+        <w:t xml:space="preserve"> 零出现（post-M1.5 复核，完整 165/165 运行日志随稿）；合并版（93953 行，67 模块分区 + 2 附加，含 20 个 z 区探针 + 构造性轨道</w:t>
       </w:r>
     </w:p>
     <w:p>
@@ -18967,7 +19438,7 @@
                 <w:i w:val="0"/>
                 <w:sz w:val="21"/>
               </w:rPr>
-              <w:t>src/ca_merged_full_25.v（91606 行，67 模块分区，20 探针 + ca_zeta_euler / ca_rip_cr 并入）</w:t>
+              <w:t>src/ca_merged_full_25.v（93953 行，67 模块分区，20 探针 + ca_zeta_euler / ca_rip_cr 并入）</w:t>
             </w:r>
           </w:p>
         </w:tc>

</xml_diff>

<commit_message>
G-9 asymptotic closed-form shipped: probe_g9_pairfrac_cr.v (10 lemmas/theorems, constructive nat/Z/Q, exact closed form c/(2(c^2-1)) for square C + two-band rational sandwich with s=floor(sqrt C) + sigT extractable cert, 4x Print Assumptions Closed, ocamlc ok) + merged m2 partition 69 (92743 lines, local 2.5 EXIT=0 after runs 12-20 sweep: eq shadowing via Import Nat, CR-scope hijack on synthesis-position numerals/muls, rewrite !-by combo, rewrite comma chain) + papers A v2.18 alignment (closed-form sentence formalized - review #6) + 30-module archive SHA 82f6410a
</commit_message>
<xml_diff>
--- a/papers/论文A正式版-CertifiedSparseGating-CPP-20260823.docx
+++ b/papers/论文A正式版-CertifiedSparseGating-CPP-20260823.docx
@@ -93,7 +93,7 @@
           <w:color w:val="444444"/>
           <w:sz w:val="21"/>
         </w:rPr>
-        <w:t xml:space="preserve">（93953 行，67 模块分区，SHA-256 基 4901f18e；G-7 批次另见合并版 </w:t>
+        <w:t xml:space="preserve">（93953 行，67 模块分区，SHA-256 基 4901f18e；G-7/G-9 批次见合并版 </w:t>
       </w:r>
       <w:r>
         <w:rPr>
@@ -113,7 +113,7 @@
           <w:color w:val="444444"/>
           <w:sz w:val="21"/>
         </w:rPr>
-        <w:t>（92506 行，68 模块分区，本地 2.5 全量编译 EXIT=0，2026-08-31），公理审计 54 Closed + 111 Dedekind 三公理、</w:t>
+        <w:t>（92743 行，69 模块分区，本地 2.5 全量编译 EXIT=0，2026-08-31），公理审计 54 Closed + 111 Dedekind 三公理、</w:t>
       </w:r>
       <w:r>
         <w:rPr>
@@ -6110,7 +6110,25 @@
           <w:i w:val="0"/>
           <w:sz w:val="24"/>
         </w:rPr>
-        <w:t>n₁n₂/(2(n₂−n₁)⌊√(n₁n₂)⌋) → √C/(2(C−1))（C=4 时 1/3）——松弛链的渐近代价有闭合形式。</w:t>
+        <w:t>n₁n₂/(2(n₂−n₁)⌊√(n₁n₂)⌋) → √C/(2(C−1))（C=4 时 1/3）——松弛链的渐近代价有闭合形式（</w:t>
+      </w:r>
+      <w:r>
+        <w:rPr>
+          <w:rFonts w:ascii="Times New Roman" w:hAnsi="Times New Roman" w:eastAsia="宋体"/>
+          <w:b/>
+          <w:i w:val="0"/>
+          <w:sz w:val="24"/>
+        </w:rPr>
+        <w:t>已形式化（G-9，`probe_g9_pairfrac_cr.v`）：完全平方 C 精确闭合 + 一般 C 双带有理夹逼 + sigT 可提取证书，零经典零公理</w:t>
+      </w:r>
+      <w:r>
+        <w:rPr>
+          <w:rFonts w:ascii="Times New Roman" w:hAnsi="Times New Roman" w:eastAsia="宋体"/>
+          <w:b w:val="0"/>
+          <w:i w:val="0"/>
+          <w:sz w:val="24"/>
+        </w:rPr>
+        <w:t>）。</w:t>
       </w:r>
     </w:p>
     <w:p>

</xml_diff>

<commit_message>
T*-1 true iff characterization shipped: probe_g11_checkiff_cr.v (constructive max g11_maxl + g11_maxl_le_iff with 0<=mu premise, g11_check_iff sound+complete both directions, g11_reject_iff exists-over-threshold, g11_fn_iff quantitative false-negative iff (slack vs margin), g11_decision_cert sigT; 6x Closed, ocamlc ok, SHA 7dceff47) + papers A v2.21 (g3_certifiable_iff honestly downgraded to one-way implication per review D7; G-11 cited as the real iff)
</commit_message>
<xml_diff>
--- a/papers/论文A正式版-CertifiedSparseGating-CPP-20260823.docx
+++ b/papers/论文A正式版-CertifiedSparseGating-CPP-20260823.docx
@@ -6197,16 +6197,16 @@
           <w:i w:val="0"/>
           <w:sz w:val="24"/>
         </w:rPr>
-        <w:t>充要性精确层口径</w:t>
-      </w:r>
-      <w:r>
-        <w:rPr>
-          <w:rFonts w:ascii="Times New Roman" w:hAnsi="Times New Roman" w:eastAsia="宋体"/>
-          <w:b w:val="0"/>
-          <w:i w:val="0"/>
-          <w:sz w:val="24"/>
-        </w:rPr>
-        <w:t>：</w:t>
+        <w:t>充要性精确层口径（G-11，真 iff）</w:t>
+      </w:r>
+      <w:r>
+        <w:rPr>
+          <w:rFonts w:ascii="Times New Roman" w:hAnsi="Times New Roman" w:eastAsia="宋体"/>
+          <w:b w:val="0"/>
+          <w:i w:val="0"/>
+          <w:sz w:val="24"/>
+        </w:rPr>
+        <w:t xml:space="preserve">：注意 </w:t>
       </w:r>
       <w:r>
         <w:rPr>
@@ -6242,7 +6242,151 @@
           <w:i w:val="0"/>
           <w:sz w:val="24"/>
         </w:rPr>
-        <w:t xml:space="preserve"> 证明——精确有理算术层上检查器通过与否等价于 Gershgorin 行和阈值条件；假阴性全部来源于可判定松弛层的保守性，而非检查器逻辑的完备性缺口（[3,7,15] 精确行和 ≈0.787 ≤ 4/5 被误拒，</w:t>
+        <w:t xml:space="preserve"> </w:t>
+      </w:r>
+      <w:r>
+        <w:rPr>
+          <w:rFonts w:ascii="Times New Roman" w:hAnsi="Times New Roman" w:eastAsia="宋体"/>
+          <w:b/>
+          <w:i w:val="0"/>
+          <w:sz w:val="24"/>
+        </w:rPr>
+        <w:t>实为单向蕴含</w:t>
+      </w:r>
+      <w:r>
+        <w:rPr>
+          <w:rFonts w:ascii="Times New Roman" w:hAnsi="Times New Roman" w:eastAsia="宋体"/>
+          <w:b w:val="0"/>
+          <w:i w:val="0"/>
+          <w:sz w:val="24"/>
+        </w:rPr>
+        <w:t xml:space="preserve">（检查器通过 ⟹ Gershgorin 框架界；名字取自早期草稿，未改）——真正的充要刻画由 </w:t>
+      </w:r>
+      <w:r>
+        <w:rPr>
+          <w:rFonts w:ascii="Times New Roman" w:hAnsi="Times New Roman" w:eastAsia="宋体"/>
+          <w:b/>
+          <w:i w:val="0"/>
+          <w:sz w:val="24"/>
+        </w:rPr>
+        <w:t>G-11 `probe_g11_checkiff_cr.v`</w:t>
+      </w:r>
+      <w:r>
+        <w:rPr>
+          <w:rFonts w:ascii="Times New Roman" w:hAnsi="Times New Roman" w:eastAsia="宋体"/>
+          <w:b w:val="0"/>
+          <w:i w:val="0"/>
+          <w:sz w:val="24"/>
+        </w:rPr>
+        <w:t>（2026-08-31，纯 nat/bool/Q 构造性，Set 层 sigT + 可提取 OCaml，6 段 Print Assumptions 全 Closed）给出：在精确有理算术层，行级检查裁定与行和阈值条件</w:t>
+      </w:r>
+      <w:r>
+        <w:rPr>
+          <w:rFonts w:ascii="Times New Roman" w:hAnsi="Times New Roman" w:eastAsia="宋体"/>
+          <w:b/>
+          <w:i w:val="0"/>
+          <w:sz w:val="24"/>
+        </w:rPr>
+        <w:t>双向等价</w:t>
+      </w:r>
+      <w:r>
+        <w:rPr>
+          <w:rFonts w:ascii="Times New Roman" w:hAnsi="Times New Roman" w:eastAsia="宋体"/>
+          <w:b w:val="0"/>
+          <w:i w:val="0"/>
+          <w:sz w:val="24"/>
+        </w:rPr>
+        <w:t>——</w:t>
+      </w:r>
+      <w:r>
+        <w:rPr>
+          <w:rFonts w:ascii="Consolas" w:hAnsi="Consolas" w:eastAsia="等线"/>
+          <w:b w:val="0"/>
+          <w:i w:val="0"/>
+          <w:sz w:val="22"/>
+        </w:rPr>
+        <w:t>g11_check_iff</w:t>
+      </w:r>
+      <w:r>
+        <w:rPr>
+          <w:rFonts w:ascii="Times New Roman" w:hAnsi="Times New Roman" w:eastAsia="宋体"/>
+          <w:b w:val="0"/>
+          <w:i w:val="0"/>
+          <w:sz w:val="24"/>
+        </w:rPr>
+        <w:t>（通过 ⟺ 逐行 ≤ 4/5，健全+完备两方向）、</w:t>
+      </w:r>
+      <w:r>
+        <w:rPr>
+          <w:rFonts w:ascii="Consolas" w:hAnsi="Consolas" w:eastAsia="等线"/>
+          <w:b w:val="0"/>
+          <w:i w:val="0"/>
+          <w:sz w:val="22"/>
+        </w:rPr>
+        <w:t>g11_reject_iff</w:t>
+      </w:r>
+      <w:r>
+        <w:rPr>
+          <w:rFonts w:ascii="Times New Roman" w:hAnsi="Times New Roman" w:eastAsia="宋体"/>
+          <w:b w:val="0"/>
+          <w:i w:val="0"/>
+          <w:sz w:val="24"/>
+        </w:rPr>
+        <w:t>（拒绝 ⟺ 存在超阈行）、</w:t>
+      </w:r>
+      <w:r>
+        <w:rPr>
+          <w:rFonts w:ascii="Consolas" w:hAnsi="Consolas" w:eastAsia="等线"/>
+          <w:b w:val="0"/>
+          <w:i w:val="0"/>
+          <w:sz w:val="22"/>
+        </w:rPr>
+        <w:t>g11_fn_iff</w:t>
+      </w:r>
+      <w:r>
+        <w:rPr>
+          <w:rFonts w:ascii="Times New Roman" w:hAnsi="Times New Roman" w:eastAsia="宋体"/>
+          <w:b w:val="0"/>
+          <w:i w:val="0"/>
+          <w:sz w:val="24"/>
+        </w:rPr>
+        <w:t>（</w:t>
+      </w:r>
+      <w:r>
+        <w:rPr>
+          <w:rFonts w:ascii="Times New Roman" w:hAnsi="Times New Roman" w:eastAsia="宋体"/>
+          <w:b/>
+          <w:i w:val="0"/>
+          <w:sz w:val="24"/>
+        </w:rPr>
+        <w:t>假阴性量化 iff</w:t>
+      </w:r>
+      <w:r>
+        <w:rPr>
+          <w:rFonts w:ascii="Times New Roman" w:hAnsi="Times New Roman" w:eastAsia="宋体"/>
+          <w:b w:val="0"/>
+          <w:i w:val="0"/>
+          <w:sz w:val="24"/>
+        </w:rPr>
+        <w:t xml:space="preserve">：精确行在阈内且被松弛拒绝 ⟺ 阈值余量非负且小于松弛盈余）与 </w:t>
+      </w:r>
+      <w:r>
+        <w:rPr>
+          <w:rFonts w:ascii="Consolas" w:hAnsi="Consolas" w:eastAsia="等线"/>
+          <w:b w:val="0"/>
+          <w:i w:val="0"/>
+          <w:sz w:val="22"/>
+        </w:rPr>
+        <w:t>g11_decision_cert</w:t>
+      </w:r>
+      <w:r>
+        <w:rPr>
+          <w:rFonts w:ascii="Times New Roman" w:hAnsi="Times New Roman" w:eastAsia="宋体"/>
+          <w:b w:val="0"/>
+          <w:i w:val="0"/>
+          <w:sz w:val="24"/>
+        </w:rPr>
+        <w:t>（sigT 决策证书，携带双向 iff）；假阴性全部来源于可判定松弛层的保守性，而非检查器逻辑的完备性缺口——G-11 的量化 iff 即此论断的精确形式（[3,7,15] 精确行和 ≈0.787 ≤ 4/5 被误拒，</w:t>
       </w:r>
       <w:r>
         <w:rPr>

</xml_diff>